<commit_message>
regenerate BCT dossier PDFs and DOCX with updated company info and establishment date
</commit_message>
<xml_diff>
--- a/Ho_so_BCT/Ho_so_dang_ky_BCT_Dien_Tu_Hieu.docx
+++ b/Ho_so_BCT/Ho_so_dang_ky_BCT_Dien_Tu_Hieu.docx
@@ -2,45 +2,6 @@
 <file path=word/document.xml><?xml version="1.0" encoding="utf-8"?>
 <w:document xmlns:wpc="http://schemas.microsoft.com/office/word/2010/wordprocessingCanvas" xmlns:mo="http://schemas.microsoft.com/office/mac/office/2008/main" xmlns:mc="http://schemas.openxmlformats.org/markup-compatibility/2006" xmlns:mv="urn:schemas-microsoft-com:mac:vml" xmlns:o="urn:schemas-microsoft-com:office:office" xmlns:r="http://schemas.openxmlformats.org/officeDocument/2006/relationships" xmlns:m="http://schemas.openxmlformats.org/officeDocument/2006/math" xmlns:v="urn:schemas-microsoft-com:vml" xmlns:wp14="http://schemas.microsoft.com/office/word/2010/wordprocessingDrawing" xmlns:wp="http://schemas.openxmlformats.org/drawingml/2006/wordprocessingDrawing" xmlns:w10="urn:schemas-microsoft-com:office:word" xmlns:w="http://schemas.openxmlformats.org/wordprocessingml/2006/main" xmlns:w14="http://schemas.microsoft.com/office/word/2010/wordml" xmlns:wpg="http://schemas.microsoft.com/office/word/2010/wordprocessingGroup" xmlns:wpi="http://schemas.microsoft.com/office/word/2010/wordprocessingInk" xmlns:wne="http://schemas.microsoft.com/office/word/2006/wordml" xmlns:wps="http://schemas.microsoft.com/office/word/2010/wordprocessingShape" mc:Ignorable="w14 wp14">
   <w:body>
-    <w:p>
-      <w:pPr>
-        <w:jc w:val="center"/>
-      </w:pPr>
-      <w:r>
-        <w:drawing>
-          <wp:inline xmlns:a="http://schemas.openxmlformats.org/drawingml/2006/main" xmlns:pic="http://schemas.openxmlformats.org/drawingml/2006/picture">
-            <wp:extent cx="864000" cy="468131"/>
-            <wp:docPr id="1" name="Picture 1"/>
-            <wp:cNvGraphicFramePr>
-              <a:graphicFrameLocks noChangeAspect="1"/>
-            </wp:cNvGraphicFramePr>
-            <a:graphic>
-              <a:graphicData uri="http://schemas.openxmlformats.org/drawingml/2006/picture">
-                <pic:pic>
-                  <pic:nvPicPr>
-                    <pic:cNvPr id="0" name="logo.jpg"/>
-                    <pic:cNvPicPr/>
-                  </pic:nvPicPr>
-                  <pic:blipFill>
-                    <a:blip r:embed="rId10"/>
-                    <a:stretch>
-                      <a:fillRect/>
-                    </a:stretch>
-                  </pic:blipFill>
-                  <pic:spPr>
-                    <a:xfrm>
-                      <a:off x="0" y="0"/>
-                      <a:ext cx="864000" cy="468131"/>
-                    </a:xfrm>
-                    <a:prstGeom prst="rect"/>
-                  </pic:spPr>
-                </pic:pic>
-              </a:graphicData>
-            </a:graphic>
-          </wp:inline>
-        </w:drawing>
-      </w:r>
-    </w:p>
     <w:p>
       <w:pPr>
         <w:jc w:val="center"/>
@@ -52,7 +13,7 @@
           <w:i w:val="0"/>
           <w:sz w:val="28"/>
         </w:rPr>
-        <w:t>CÔNG TY TNHH MTV ĐIỆN TỬ HIẾU</w:t>
+        <w:t>CÔNG TY TNHH MTV ĐIỆN MÁY HIẾU</w:t>
       </w:r>
     </w:p>
     <w:p>
@@ -463,7 +424,7 @@
                 <w:b w:val="0"/>
                 <w:sz w:val="24"/>
               </w:rPr>
-              <w:t>0979.553.289 - Congvinh298@gmail.com</w:t>
+              <w:t>0979.553.289 - Congvinh28@gmail.com</w:t>
             </w:r>
           </w:p>
         </w:tc>
@@ -520,7 +481,7 @@
                 <w:b/>
                 <w:sz w:val="22"/>
               </w:rPr>
-              <w:t>CÔNG TY TNHH MTV ĐIỆN TỬ HIẾU</w:t>
+              <w:t>CÔNG TY TNHH MTV ĐIỆN MÁY HIẾU</w:t>
               <w:br/>
               <w:t>Số: 01/2026/ĐK-TMĐT</w:t>
             </w:r>
@@ -615,7 +576,7 @@
           <w:b w:val="0"/>
           <w:i w:val="0"/>
         </w:rPr>
-        <w:t>Tên đăng ký: CÔNG TY TNHH MTV ĐIỆN TỬ HIẾU</w:t>
+        <w:t>Tên đăng ký: CÔNG TY TNHH MTV ĐIỆN MÁY HIẾU</w:t>
       </w:r>
     </w:p>
     <w:p>
@@ -628,7 +589,7 @@
           <w:b w:val="0"/>
           <w:i w:val="0"/>
         </w:rPr>
-        <w:t>Tên giao dịch: ĐIỆN TỬ HIẾU</w:t>
+        <w:t>Tên giao dịch: ĐIỆN MÁY HIẾU</w:t>
       </w:r>
     </w:p>
     <w:p>
@@ -1029,7 +990,7 @@
                 <w:b w:val="0"/>
                 <w:sz w:val="24"/>
               </w:rPr>
-              <w:t>Số 166, Ấp Bình Thạnh 1, Xã Lấp Vò, Tỉnh Đồng Tháp, Việt Nam</w:t>
+              <w:t>166, Ấp Bình Thạnh 1, Xã Lấp Vò, Huyện Lấp Vò, Tỉnh Đồng Tháp, Việt Nam</w:t>
             </w:r>
           </w:p>
         </w:tc>
@@ -1052,7 +1013,7 @@
                 <w:b w:val="0"/>
                 <w:sz w:val="24"/>
               </w:rPr>
-              <w:t>Số 166, Ấp Bình Thạnh 1, Xã Lấp Vò, Tỉnh Đồng Tháp, Việt Nam</w:t>
+              <w:t>166, Ấp Bình Thạnh 1, Xã Lấp Vò, Huyện Lấp Vò, Tỉnh Đồng Tháp, Việt Nam</w:t>
             </w:r>
           </w:p>
         </w:tc>
@@ -1217,7 +1178,7 @@
                 <w:b w:val="0"/>
                 <w:sz w:val="24"/>
               </w:rPr>
-              <w:t>Congvinh298@gmail.com</w:t>
+              <w:t>Congvinh28@gmail.com</w:t>
             </w:r>
           </w:p>
         </w:tc>
@@ -1240,7 +1201,7 @@
                 <w:b w:val="0"/>
                 <w:sz w:val="24"/>
               </w:rPr>
-              <w:t>Congvinh298@gmail.com</w:t>
+              <w:t>Congvinh28@gmail.com</w:t>
             </w:r>
           </w:p>
         </w:tc>
@@ -1360,7 +1321,7 @@
           <w:b w:val="0"/>
           <w:i w:val="0"/>
         </w:rPr>
-        <w:t>Địa chỉ: Số 166, Ấp Bình Thạnh 1, Xã Lấp Vò, Tỉnh Đồng Tháp, Việt Nam</w:t>
+        <w:t>Địa chỉ: 166, Ấp Bình Thạnh 1, Xã Lấp Vò, Huyện Lấp Vò, Tỉnh Đồng Tháp, Việt Nam</w:t>
       </w:r>
     </w:p>
     <w:p>
@@ -1370,7 +1331,7 @@
           <w:b w:val="0"/>
           <w:i w:val="0"/>
         </w:rPr>
-        <w:t>Điện thoại: 0979.553.289    Email: Congvinh298@gmail.com</w:t>
+        <w:t>Điện thoại: 0979.553.289    Email: Congvinh28@gmail.com</w:t>
       </w:r>
     </w:p>
     <w:p>
@@ -1987,7 +1948,7 @@
                 <w:b/>
                 <w:sz w:val="22"/>
               </w:rPr>
-              <w:t>CÔNG TY TNHH MTV ĐIỆN TỬ HIẾU</w:t>
+              <w:t>CÔNG TY TNHH MTV ĐIỆN MÁY HIẾU</w:t>
               <w:br/>
               <w:t>Số: 02/2026/ĐA-TMĐT</w:t>
             </w:r>
@@ -2093,7 +2054,7 @@
           <w:b w:val="0"/>
           <w:i w:val="0"/>
         </w:rPr>
-        <w:t>CÔNG TY TNHH MTV ĐIỆN TỬ HIẾU là công ty TNHH một thành viên do ông TRẦN CÔNG VINH làm người đại diện theo pháp luật, mã số doanh nghiệp/mã số thuế 1402228630, ngày cấp 06/04/2026, trụ sở tại Số 166, Ấp Bình Thạnh 1, Xã Lấp Vò, Tỉnh Đồng Tháp, Việt Nam. Công ty xây dựng và vận hành website Chợ Lấp Vò Online tại tên miền dienmayhieu.com theo mô hình sàn giao dịch thương mại điện tử, kết nối người dùng với người bán, nhà cung cấp, đối tác dịch vụ và các nhóm dịch vụ số phù hợp.</w:t>
+        <w:t>CÔNG TY TNHH MTV ĐIỆN MÁY HIẾU là công ty TNHH một thành viên do ông TRẦN CÔNG VINH làm người đại diện theo pháp luật, mã số doanh nghiệp/mã số thuế 1402228630, ngày cấp 06/04/2026, trụ sở tại 166, Ấp Bình Thạnh 1, Xã Lấp Vò, Huyện Lấp Vò, Tỉnh Đồng Tháp, Việt Nam. Công ty xây dựng và vận hành website Chợ Lấp Vò Online tại tên miền dienmayhieu.com theo mô hình sàn giao dịch thương mại điện tử, kết nối người dùng với người bán, nhà cung cấp, đối tác dịch vụ và các nhóm dịch vụ số phù hợp.</w:t>
       </w:r>
     </w:p>
     <w:p>
@@ -2420,7 +2381,7 @@
                 <w:b w:val="0"/>
                 <w:sz w:val="24"/>
               </w:rPr>
-              <w:t>Số 166, Ấp Bình Thạnh 1, Xã Lấp Vò, Tỉnh Đồng Tháp, Việt Nam</w:t>
+              <w:t>166, Ấp Bình Thạnh 1, Xã Lấp Vò, Huyện Lấp Vò, Tỉnh Đồng Tháp, Việt Nam</w:t>
             </w:r>
           </w:p>
         </w:tc>
@@ -2562,7 +2523,7 @@
                 <w:b w:val="0"/>
                 <w:sz w:val="24"/>
               </w:rPr>
-              <w:t>Congvinh298@gmail.com</w:t>
+              <w:t>Congvinh28@gmail.com</w:t>
             </w:r>
           </w:p>
         </w:tc>
@@ -4361,7 +4322,7 @@
                 <w:b/>
                 <w:sz w:val="22"/>
               </w:rPr>
-              <w:t>CÔNG TY TNHH MTV ĐIỆN TỬ HIẾU</w:t>
+              <w:t>CÔNG TY TNHH MTV ĐIỆN MÁY HIẾU</w:t>
               <w:br/>
               <w:t>Số: 03/2026/QC-TMĐT</w:t>
             </w:r>
@@ -4457,7 +4418,7 @@
           <w:b w:val="0"/>
           <w:i w:val="0"/>
         </w:rPr>
-        <w:t>Chợ Lấp Vò Online là nền tảng số do CÔNG TY TNHH MTV ĐIỆN TỬ HIẾU xây dựng và vận hành nhằm kết nối người mua, người bán, nhà cung cấp dịch vụ, đối tác việc làm, đối tác nội dung số và các nhóm dịch vụ phù hợp.</w:t>
+        <w:t>Chợ Lấp Vò Online là nền tảng số do CÔNG TY TNHH MTV ĐIỆN MÁY HIẾU xây dựng và vận hành nhằm kết nối người mua, người bán, nhà cung cấp dịch vụ, đối tác việc làm, đối tác nội dung số và các nhóm dịch vụ phù hợp.</w:t>
       </w:r>
     </w:p>
     <w:p>
@@ -5311,7 +5272,7 @@
           <w:b w:val="0"/>
           <w:i w:val="0"/>
         </w:rPr>
-        <w:t>CÔNG TY TNHH MTV ĐIỆN TỬ HIẾU cam kết vận hành website Chợ Lấp Vò Online theo quy chế này, tuân thủ quy định pháp luật về thương mại điện tử, bảo vệ người tiêu dùng, bảo vệ dữ liệu cá nhân và nghĩa vụ báo cáo với cơ quan quản lý nhà nước có thẩm quyền.</w:t>
+        <w:t>CÔNG TY TNHH MTV ĐIỆN MÁY HIẾU cam kết vận hành website Chợ Lấp Vò Online theo quy chế này, tuân thủ quy định pháp luật về thương mại điện tử, bảo vệ người tiêu dùng, bảo vệ dữ liệu cá nhân và nghĩa vụ báo cáo với cơ quan quản lý nhà nước có thẩm quyền.</w:t>
       </w:r>
     </w:p>
     <w:tbl>
@@ -5424,7 +5385,7 @@
                 <w:b w:val="0"/>
                 <w:sz w:val="24"/>
               </w:rPr>
-              <w:t>CÔNG TY TNHH MTV ĐIỆN TỬ HIẾU</w:t>
+              <w:t>CÔNG TY TNHH MTV ĐIỆN MÁY HIẾU</w:t>
             </w:r>
           </w:p>
         </w:tc>
@@ -5472,7 +5433,7 @@
                 <w:b w:val="0"/>
                 <w:sz w:val="24"/>
               </w:rPr>
-              <w:t>Số 166, Ấp Bình Thạnh 1, Xã Lấp Vò, Tỉnh Đồng Tháp, Việt Nam</w:t>
+              <w:t>166, Ấp Bình Thạnh 1, Xã Lấp Vò, Huyện Lấp Vò, Tỉnh Đồng Tháp, Việt Nam</w:t>
             </w:r>
           </w:p>
         </w:tc>
@@ -5568,7 +5529,7 @@
                 <w:b w:val="0"/>
                 <w:sz w:val="24"/>
               </w:rPr>
-              <w:t>Congvinh298@gmail.com</w:t>
+              <w:t>Congvinh28@gmail.com</w:t>
             </w:r>
           </w:p>
         </w:tc>

</xml_diff>

<commit_message>
feat: cap nhat he thong dang ky BCT (CV0014) - bao mat, mat khau thu nghiem, loc tu khoa cam
</commit_message>
<xml_diff>
--- a/Ho_so_BCT/Ho_so_dang_ky_BCT_Dien_Tu_Hieu.docx
+++ b/Ho_so_BCT/Ho_so_dang_ky_BCT_Dien_Tu_Hieu.docx
@@ -424,7 +424,7 @@
                 <w:b w:val="0"/>
                 <w:sz w:val="24"/>
               </w:rPr>
-              <w:t>0979.553.289 - Congvinh28@gmail.com</w:t>
+              <w:t>0979.553.289 - Congvinh298@gmail.com</w:t>
             </w:r>
           </w:p>
         </w:tc>
@@ -1178,7 +1178,7 @@
                 <w:b w:val="0"/>
                 <w:sz w:val="24"/>
               </w:rPr>
-              <w:t>Congvinh28@gmail.com</w:t>
+              <w:t>Congvinh298@gmail.com</w:t>
             </w:r>
           </w:p>
         </w:tc>
@@ -1201,7 +1201,7 @@
                 <w:b w:val="0"/>
                 <w:sz w:val="24"/>
               </w:rPr>
-              <w:t>Congvinh28@gmail.com</w:t>
+              <w:t>Congvinh298@gmail.com</w:t>
             </w:r>
           </w:p>
         </w:tc>
@@ -1331,7 +1331,7 @@
           <w:b w:val="0"/>
           <w:i w:val="0"/>
         </w:rPr>
-        <w:t>Điện thoại: 0979.553.289    Email: Congvinh28@gmail.com</w:t>
+        <w:t>Điện thoại: 0979.553.289    Email: Congvinh298@gmail.com</w:t>
       </w:r>
     </w:p>
     <w:p>
@@ -2523,7 +2523,7 @@
                 <w:b w:val="0"/>
                 <w:sz w:val="24"/>
               </w:rPr>
-              <w:t>Congvinh28@gmail.com</w:t>
+              <w:t>Congvinh298@gmail.com</w:t>
             </w:r>
           </w:p>
         </w:tc>
@@ -3902,7 +3902,7 @@
           <w:b w:val="0"/>
           <w:i w:val="0"/>
         </w:rPr>
-        <w:t>Hệ thống website đặt tại hạ tầng hosting của VinaHost, sử dụng tên miền dienmayhieu.com và kết nối HTTPS.</w:t>
+        <w:t>Hệ thống website đặt tại hạ tầng hosting của VinaHost, sử dụng tên miền dienmayhieu.com và kết nối bảo mật HTTPS (SSL).</w:t>
       </w:r>
     </w:p>
     <w:p>
@@ -3915,7 +3915,7 @@
           <w:b w:val="0"/>
           <w:i w:val="0"/>
         </w:rPr>
-        <w:t>Hệ thống quản trị phân quyền theo tài khoản, có cơ chế đăng nhập, lưu vết thao tác, chống truy cập trái phép ở mức ứng dụng.</w:t>
+        <w:t>Mật khẩu người dùng được băm tự động bằng thuật toán BCRYPT bảo mật cao dưới dạng một chiều, đảm bảo không thể xem trực tiếp mật khẩu từ cơ sở dữ liệu.</w:t>
       </w:r>
     </w:p>
     <w:p>
@@ -3928,7 +3928,7 @@
           <w:b w:val="0"/>
           <w:i w:val="0"/>
         </w:rPr>
-        <w:t>Dữ liệu giao dịch, đơn hàng, người dùng, đối tác và báo cáo được lưu trong cơ sở dữ liệu của hệ thống; công ty thực hiện sao lưu và kiểm tra định kỳ theo năng lực hạ tầng.</w:t>
+        <w:t>Hệ thống quản trị phân quyền theo tài khoản, có cơ chế đăng nhập mã OTP/Key bảo mật, lưu vết thao tác (audit logs) để chống truy cập trái phép ở mức ứng dụng.</w:t>
       </w:r>
     </w:p>
     <w:p>
@@ -3941,7 +3941,7 @@
           <w:b w:val="0"/>
           <w:i w:val="0"/>
         </w:rPr>
-        <w:t>Phương án kết nối báo cáo với Cổng quản lý hoạt động TMĐT: cung cấp API báo cáo tại https://dienmayhieu.com/api_baocao_bct.php.</w:t>
+        <w:t>Dữ liệu giao dịch, đơn hàng, người dùng, đối tác và báo cáo được lưu trong cơ sở dữ liệu của hệ thống; công ty thực hiện sao lưu tự động định kỳ.</w:t>
       </w:r>
     </w:p>
     <w:p>
@@ -3954,7 +3954,46 @@
           <w:b w:val="0"/>
           <w:i w:val="0"/>
         </w:rPr>
-        <w:t>API hỗ trợ xác thực bằng tài khoản và API key; hệ thống lưu BCT_REPORT_API_KEY_HASH dạng SHA-256, không lưu API key thô trong mã nguồn.</w:t>
+        <w:t>Tích hợp hệ thống tiền kiểm từ khóa prohibited_keywords để tự động chặn các tin đăng có chứa từ ngữ vi phạm pháp luật hoặc đạo đức trước khi lưu trữ vào cơ sở dữ liệu.</w:t>
+      </w:r>
+    </w:p>
+    <w:p>
+      <w:pPr>
+        <w:pStyle w:val="ListBullet"/>
+      </w:pPr>
+      <w:r>
+        <w:rPr>
+          <w:rFonts w:ascii="Times New Roman" w:hAnsi="Times New Roman" w:eastAsia="Times New Roman" w:cs="Times New Roman"/>
+          <w:b w:val="0"/>
+          <w:i w:val="0"/>
+        </w:rPr>
+        <w:t>Chế độ bảo vệ thử nghiệm: Thiết lập chế độ mật khẩu bao trùm toàn trang (site-wide password protection) thông qua tệp cấu hình .env (SITE_PASSWORD_PROTECT=1) để phục vụ kiểm tra nội bộ và thẩm định hồ sơ của Bộ Công Thương.</w:t>
+      </w:r>
+    </w:p>
+    <w:p>
+      <w:pPr>
+        <w:pStyle w:val="ListBullet"/>
+      </w:pPr>
+      <w:r>
+        <w:rPr>
+          <w:rFonts w:ascii="Times New Roman" w:hAnsi="Times New Roman" w:eastAsia="Times New Roman" w:cs="Times New Roman"/>
+          <w:b w:val="0"/>
+          <w:i w:val="0"/>
+        </w:rPr>
+        <w:t>Phương án kết nối báo cáo với Cổng quản lý hoạt động TMĐT: cung cấp API báo cáo và cổng đăng nhập giám sát bct_portal.php dành riêng cho Bộ Công Thương.</w:t>
+      </w:r>
+    </w:p>
+    <w:p>
+      <w:pPr>
+        <w:pStyle w:val="ListBullet"/>
+      </w:pPr>
+      <w:r>
+        <w:rPr>
+          <w:rFonts w:ascii="Times New Roman" w:hAnsi="Times New Roman" w:eastAsia="Times New Roman" w:cs="Times New Roman"/>
+          <w:b w:val="0"/>
+          <w:i w:val="0"/>
+        </w:rPr>
+        <w:t>API hỗ trợ xác thực bằng tài khoản và API key; hệ thống lưu mật khẩu dạng SHA-256 mã hóa, không lưu API key thô trong mã nguồn.</w:t>
       </w:r>
     </w:p>
     <w:p>
@@ -5018,13 +5057,16 @@
       </w:r>
     </w:p>
     <w:p>
+      <w:pPr>
+        <w:pStyle w:val="Heading2"/>
+      </w:pPr>
       <w:r>
         <w:rPr>
           <w:rFonts w:ascii="Times New Roman" w:hAnsi="Times New Roman" w:eastAsia="Times New Roman" w:cs="Times New Roman"/>
           <w:b w:val="0"/>
           <w:i w:val="0"/>
         </w:rPr>
-        <w:t>Công ty thu thập dữ liệu cá nhân ở mức cần thiết gồm họ tên, số điện thoại, địa chỉ, vị trí khi người dùng cấp quyền, thông tin giao dịch, phản ánh, dữ liệu kỹ thuật và dữ liệu đối soát. Dữ liệu được dùng để xác minh, xử lý giao dịch, điều phối dịch vụ, chăm sóc khách hàng, phòng chống gian lận, cải thiện hệ thống và tuân thủ nghĩa vụ pháp lý.</w:t>
+        <w:t>1. Mục đích thu thập thông tin cá nhân:</w:t>
       </w:r>
     </w:p>
     <w:p>
@@ -5034,12 +5076,12 @@
           <w:b w:val="0"/>
           <w:i w:val="0"/>
         </w:rPr>
-        <w:t>Công ty không bán dữ liệu cá nhân cho bên thứ ba. Việc chia sẻ dữ liệu chỉ thực hiện ở mức cần thiết cho người bán, nhà cung cấp, đối tác giao nhận, kỹ thuật, thanh toán hoặc cơ quan nhà nước có thẩm quyền. Người dùng có thể yêu cầu kiểm tra, chỉnh sửa, hạn chế xử lý hoặc xóa dữ liệu trong phạm vi pháp luật cho phép.</w:t>
+        <w:t>Công ty thu thập thông tin cá nhân của người tiêu dùng nhằm xác minh danh tính, xử lý đơn đặt hàng, cung cấp các dịch vụ trên website, liên hệ hỗ trợ kỹ thuật, giải quyết tranh chấp khiếu nại, cải thiện trải nghiệm người dùng và tuân thủ các nghĩa vụ pháp lý theo quy định của pháp luật Việt Nam.</w:t>
       </w:r>
     </w:p>
     <w:p>
       <w:pPr>
-        <w:pStyle w:val="Heading1"/>
+        <w:pStyle w:val="Heading2"/>
       </w:pPr>
       <w:r>
         <w:rPr>
@@ -5047,25 +5089,22 @@
           <w:b w:val="0"/>
           <w:i w:val="0"/>
         </w:rPr>
-        <w:t>VII. Quản lý thông tin trên website</w:t>
+        <w:t>2. Phạm vi sử dụng thông tin:</w:t>
       </w:r>
     </w:p>
     <w:p>
-      <w:pPr>
-        <w:pStyle w:val="ListBullet"/>
-      </w:pPr>
       <w:r>
         <w:rPr>
           <w:rFonts w:ascii="Times New Roman" w:hAnsi="Times New Roman" w:eastAsia="Times New Roman" w:cs="Times New Roman"/>
           <w:b w:val="0"/>
           <w:i w:val="0"/>
         </w:rPr>
-        <w:t>Ban quản lý có quyền rà soát, yêu cầu chỉnh sửa, từ chối hoặc gỡ bỏ thông tin vi phạm quy chế, vi phạm pháp luật hoặc gây rủi ro cho người tiêu dùng.</w:t>
+        <w:t>Thông tin được thu thập bao gồm: Họ tên, số điện thoại, email, địa chỉ thường trú/giao nhận hàng, và tọa độ địa lý (khi người dùng cho phép). Thông tin chỉ được sử dụng trong phạm vi cung cấp dịch vụ của website dienmayhieu.com, đối soát thanh toán và hỗ trợ thợ kỹ thuật liên lạc thực hiện dịch vụ.</w:t>
       </w:r>
     </w:p>
     <w:p>
       <w:pPr>
-        <w:pStyle w:val="ListBullet"/>
+        <w:pStyle w:val="Heading2"/>
       </w:pPr>
       <w:r>
         <w:rPr>
@@ -5073,20 +5112,314 @@
           <w:b w:val="0"/>
           <w:i w:val="0"/>
         </w:rPr>
-        <w:t>Thông tin hàng hóa, dịch vụ phải mô tả đúng bản chất, nguồn gốc, giá, phí, điều kiện cung cấp và các hạn chế nếu có.</w:t>
+        <w:t>3. Thời gian lưu trữ thông tin:</w:t>
       </w:r>
     </w:p>
     <w:p>
-      <w:pPr>
-        <w:pStyle w:val="ListBullet"/>
-      </w:pPr>
       <w:r>
         <w:rPr>
           <w:rFonts w:ascii="Times New Roman" w:hAnsi="Times New Roman" w:eastAsia="Times New Roman" w:cs="Times New Roman"/>
           <w:b w:val="0"/>
           <w:i w:val="0"/>
         </w:rPr>
-        <w:t>Công ty áp dụng kiểm soát thủ công, tài khoản quản trị, nhật ký hệ thống, từ khóa cảnh báo và biện pháp kỹ thuật phù hợp để quản lý thông tin.</w:t>
+        <w:t>Thông tin cá nhân của thành viên sẽ được lưu trữ trong suốt thời gian tài khoản hoạt động trên website. Trong trường hợp thành viên yêu cầu hủy bỏ hoặc tài khoản bị khóa, thông tin cá nhân vẫn sẽ được lưu trữ bảo mật trên máy chủ trong thời hạn tối thiểu là 02 năm để phục vụ công tác đối soát, thanh tra của cơ quan nhà nước có thẩm quyền.</w:t>
+      </w:r>
+    </w:p>
+    <w:p>
+      <w:pPr>
+        <w:pStyle w:val="Heading2"/>
+      </w:pPr>
+      <w:r>
+        <w:rPr>
+          <w:rFonts w:ascii="Times New Roman" w:hAnsi="Times New Roman" w:eastAsia="Times New Roman" w:cs="Times New Roman"/>
+          <w:b w:val="0"/>
+          <w:i w:val="0"/>
+        </w:rPr>
+        <w:t>4. Những người hoặc tổ chức có thể tiếp cận với thông tin:</w:t>
+      </w:r>
+    </w:p>
+    <w:p>
+      <w:r>
+        <w:rPr>
+          <w:rFonts w:ascii="Times New Roman" w:hAnsi="Times New Roman" w:eastAsia="Times New Roman" w:cs="Times New Roman"/>
+          <w:b w:val="0"/>
+          <w:i w:val="0"/>
+        </w:rPr>
+        <w:t>Những đối tượng có quyền tiếp cận thông tin cá nhân của người tiêu dùng bao gồm: (i) Ban quản lý website dienmayhieu.com; (ii) Cửa hàng/thợ kỹ thuật trực tiếp thực hiện đơn hàng/dịch vụ (chỉ tiếp cận thông tin liên hệ và địa điểm để giao dịch); (iii) Đơn vị trung gian thanh toán và vận chuyển liên kết; (iv) Cơ quan quản lý nhà nước có thẩm quyền khi có yêu cầu bằng văn bản chính thức.</w:t>
+      </w:r>
+    </w:p>
+    <w:p>
+      <w:pPr>
+        <w:pStyle w:val="Heading2"/>
+      </w:pPr>
+      <w:r>
+        <w:rPr>
+          <w:rFonts w:ascii="Times New Roman" w:hAnsi="Times New Roman" w:eastAsia="Times New Roman" w:cs="Times New Roman"/>
+          <w:b w:val="0"/>
+          <w:i w:val="0"/>
+        </w:rPr>
+        <w:t>5. Địa chỉ của đơn vị thu thập và quản lý thông tin:</w:t>
+      </w:r>
+    </w:p>
+    <w:p>
+      <w:r>
+        <w:rPr>
+          <w:rFonts w:ascii="Times New Roman" w:hAnsi="Times New Roman" w:eastAsia="Times New Roman" w:cs="Times New Roman"/>
+          <w:b w:val="0"/>
+          <w:i w:val="0"/>
+        </w:rPr>
+        <w:t>CÔNG TY TNHH MTV ĐIỆN MÁY HIẾU. Địa chỉ: 166, Ấp Bình Thạnh 1, Xã Lấp Vò, Huyện Lấp Vò, Tỉnh Đồng Tháp. Người đại diện: Trần Công Vinh - Giám đốc. Hotline liên hệ hỏi về hoạt động thu thập, xử lý dữ liệu: 0979.553.289. Email: congvinh298@gmail.com.</w:t>
+      </w:r>
+    </w:p>
+    <w:p>
+      <w:pPr>
+        <w:pStyle w:val="Heading2"/>
+      </w:pPr>
+      <w:r>
+        <w:rPr>
+          <w:rFonts w:ascii="Times New Roman" w:hAnsi="Times New Roman" w:eastAsia="Times New Roman" w:cs="Times New Roman"/>
+          <w:b w:val="0"/>
+          <w:i w:val="0"/>
+        </w:rPr>
+        <w:t>6. Phương thức và công cụ để người dùng tiếp cận và chỉnh sửa dữ liệu cá nhân:</w:t>
+      </w:r>
+    </w:p>
+    <w:p>
+      <w:r>
+        <w:rPr>
+          <w:rFonts w:ascii="Times New Roman" w:hAnsi="Times New Roman" w:eastAsia="Times New Roman" w:cs="Times New Roman"/>
+          <w:b w:val="0"/>
+          <w:i w:val="0"/>
+        </w:rPr>
+        <w:t>Thành viên có thể tự truy cập vào trang cá nhân của mình trên website để tự chỉnh sửa, cập nhật thông tin cá nhân. Ngoài ra, thành viên có thể liên hệ trực tiếp với Ban quản lý qua hotline hoặc email để yêu cầu nhân viên kỹ thuật hỗ trợ thay đổi, khóa hoặc xóa dữ liệu cá nhân của mình.</w:t>
+      </w:r>
+    </w:p>
+    <w:p>
+      <w:pPr>
+        <w:pStyle w:val="Heading2"/>
+      </w:pPr>
+      <w:r>
+        <w:rPr>
+          <w:rFonts w:ascii="Times New Roman" w:hAnsi="Times New Roman" w:eastAsia="Times New Roman" w:cs="Times New Roman"/>
+          <w:b w:val="0"/>
+          <w:i w:val="0"/>
+        </w:rPr>
+        <w:t>7. Cơ chế tiếp nhận và giải quyết khiếu nại của người tiêu dùng liên quan đến việc thông tin cá nhân bị sử dụng sai mục đích hoặc phạm vi thông báo:</w:t>
+      </w:r>
+    </w:p>
+    <w:p>
+      <w:r>
+        <w:rPr>
+          <w:rFonts w:ascii="Times New Roman" w:hAnsi="Times New Roman" w:eastAsia="Times New Roman" w:cs="Times New Roman"/>
+          <w:b w:val="0"/>
+          <w:i w:val="0"/>
+        </w:rPr>
+        <w:t>Khi phát hiện thông tin cá nhân bị sử dụng sai mục đích hoặc ngoài phạm vi thỏa thuận, người tiêu dùng gửi khiếu nại đến email congvinh298@gmail.com hoặc gọi hotline 0979.553.289. Ban quản lý có trách nhiệm phản hồi và đưa ra biện pháp xử lý trong vòng 03 ngày làm việc. Nếu vụ việc phức tạp, hai bên sẽ phối hợp thương lượng hoặc chuyển cơ quan chức năng giải quyết.</w:t>
+      </w:r>
+    </w:p>
+    <w:p>
+      <w:pPr>
+        <w:pStyle w:val="Heading1"/>
+      </w:pPr>
+      <w:r>
+        <w:rPr>
+          <w:rFonts w:ascii="Times New Roman" w:hAnsi="Times New Roman" w:eastAsia="Times New Roman" w:cs="Times New Roman"/>
+          <w:b w:val="0"/>
+          <w:i w:val="0"/>
+        </w:rPr>
+        <w:t>VII. Cơ chế quản lý thông tin trên website và kiểm soát thông tin xấu</w:t>
+      </w:r>
+    </w:p>
+    <w:p>
+      <w:pPr>
+        <w:pStyle w:val="Heading2"/>
+      </w:pPr>
+      <w:r>
+        <w:rPr>
+          <w:rFonts w:ascii="Times New Roman" w:hAnsi="Times New Roman" w:eastAsia="Times New Roman" w:cs="Times New Roman"/>
+          <w:b w:val="0"/>
+          <w:i w:val="0"/>
+        </w:rPr>
+        <w:t>1. Danh sách hàng hóa, dịch vụ cấm giao dịch tại dienmayhieu.com:</w:t>
+      </w:r>
+    </w:p>
+    <w:p>
+      <w:pPr>
+        <w:pStyle w:val="ListBullet"/>
+      </w:pPr>
+      <w:r>
+        <w:rPr>
+          <w:rFonts w:ascii="Times New Roman" w:hAnsi="Times New Roman" w:eastAsia="Times New Roman" w:cs="Times New Roman"/>
+          <w:b w:val="0"/>
+          <w:i w:val="0"/>
+        </w:rPr>
+        <w:t>Vũ khí quân dụng, súng, đạn, pháo hoa, vật liệu nổ.</w:t>
+      </w:r>
+    </w:p>
+    <w:p>
+      <w:pPr>
+        <w:pStyle w:val="ListBullet"/>
+      </w:pPr>
+      <w:r>
+        <w:rPr>
+          <w:rFonts w:ascii="Times New Roman" w:hAnsi="Times New Roman" w:eastAsia="Times New Roman" w:cs="Times New Roman"/>
+          <w:b w:val="0"/>
+          <w:i w:val="0"/>
+        </w:rPr>
+        <w:t>Chất ma túy, cần sa, thuốc phiện và các chất hướng thần.</w:t>
+      </w:r>
+    </w:p>
+    <w:p>
+      <w:pPr>
+        <w:pStyle w:val="ListBullet"/>
+      </w:pPr>
+      <w:r>
+        <w:rPr>
+          <w:rFonts w:ascii="Times New Roman" w:hAnsi="Times New Roman" w:eastAsia="Times New Roman" w:cs="Times New Roman"/>
+          <w:b w:val="0"/>
+          <w:i w:val="0"/>
+        </w:rPr>
+        <w:t>Tài liệu đồi trụy, phản động, xâm phạm an ninh quốc gia.</w:t>
+      </w:r>
+    </w:p>
+    <w:p>
+      <w:pPr>
+        <w:pStyle w:val="ListBullet"/>
+      </w:pPr>
+      <w:r>
+        <w:rPr>
+          <w:rFonts w:ascii="Times New Roman" w:hAnsi="Times New Roman" w:eastAsia="Times New Roman" w:cs="Times New Roman"/>
+          <w:b w:val="0"/>
+          <w:i w:val="0"/>
+        </w:rPr>
+        <w:t>Hàng giả, hàng nhái nhãn hiệu, hàng vi phạm quyền sở hữu trí tuệ.</w:t>
+      </w:r>
+    </w:p>
+    <w:p>
+      <w:pPr>
+        <w:pStyle w:val="ListBullet"/>
+      </w:pPr>
+      <w:r>
+        <w:rPr>
+          <w:rFonts w:ascii="Times New Roman" w:hAnsi="Times New Roman" w:eastAsia="Times New Roman" w:cs="Times New Roman"/>
+          <w:b w:val="0"/>
+          <w:i w:val="0"/>
+        </w:rPr>
+        <w:t>Động thực vật hoang dã quý hiếm cần bảo vệ.</w:t>
+      </w:r>
+    </w:p>
+    <w:p>
+      <w:pPr>
+        <w:pStyle w:val="ListBullet"/>
+      </w:pPr>
+      <w:r>
+        <w:rPr>
+          <w:rFonts w:ascii="Times New Roman" w:hAnsi="Times New Roman" w:eastAsia="Times New Roman" w:cs="Times New Roman"/>
+          <w:b w:val="0"/>
+          <w:i w:val="0"/>
+        </w:rPr>
+        <w:t>Dịch vụ cờ bạc, cá độ, lô đề, mại dâm, môi giới bất hợp pháp.</w:t>
+      </w:r>
+    </w:p>
+    <w:p>
+      <w:pPr>
+        <w:pStyle w:val="ListBullet"/>
+      </w:pPr>
+      <w:r>
+        <w:rPr>
+          <w:rFonts w:ascii="Times New Roman" w:hAnsi="Times New Roman" w:eastAsia="Times New Roman" w:cs="Times New Roman"/>
+          <w:b w:val="0"/>
+          <w:i w:val="0"/>
+        </w:rPr>
+        <w:t>Các loại hóa chất độc hại, chất cấm theo quy định của Bộ Công Thương.</w:t>
+      </w:r>
+    </w:p>
+    <w:p>
+      <w:pPr>
+        <w:pStyle w:val="Heading2"/>
+      </w:pPr>
+      <w:r>
+        <w:rPr>
+          <w:rFonts w:ascii="Times New Roman" w:hAnsi="Times New Roman" w:eastAsia="Times New Roman" w:cs="Times New Roman"/>
+          <w:b w:val="0"/>
+          <w:i w:val="0"/>
+        </w:rPr>
+        <w:t>2. Quy trình kiểm duyệt và biện pháp xử lý vi phạm:</w:t>
+      </w:r>
+    </w:p>
+    <w:p>
+      <w:pPr>
+        <w:pStyle w:val="ListBullet"/>
+      </w:pPr>
+      <w:r>
+        <w:rPr>
+          <w:rFonts w:ascii="Times New Roman" w:hAnsi="Times New Roman" w:eastAsia="Times New Roman" w:cs="Times New Roman"/>
+          <w:b w:val="0"/>
+          <w:i w:val="0"/>
+        </w:rPr>
+        <w:t>Tiền kiểm tự động: Hệ thống sử dụng bộ lọc từ khóa cấm (ví dụ: súng, đạn, ma túy, cờ bạc...) để ngăn chặn người bán tạo sản phẩm vi phạm ngay từ lúc gửi tin.</w:t>
+      </w:r>
+    </w:p>
+    <w:p>
+      <w:pPr>
+        <w:pStyle w:val="ListBullet"/>
+      </w:pPr>
+      <w:r>
+        <w:rPr>
+          <w:rFonts w:ascii="Times New Roman" w:hAnsi="Times New Roman" w:eastAsia="Times New Roman" w:cs="Times New Roman"/>
+          <w:b w:val="0"/>
+          <w:i w:val="0"/>
+        </w:rPr>
+        <w:t>Hậu kiểm thủ công: Ban quản lý rà soát hàng ngày các tin đăng mới. Nếu phát hiện vi phạm nhẹ, sẽ nhắc nhở và yêu cầu sửa đổi trong 24h.</w:t>
+      </w:r>
+    </w:p>
+    <w:p>
+      <w:pPr>
+        <w:pStyle w:val="ListBullet"/>
+      </w:pPr>
+      <w:r>
+        <w:rPr>
+          <w:rFonts w:ascii="Times New Roman" w:hAnsi="Times New Roman" w:eastAsia="Times New Roman" w:cs="Times New Roman"/>
+          <w:b w:val="0"/>
+          <w:i w:val="0"/>
+        </w:rPr>
+        <w:t>Gỡ bỏ và khóa tài khoản: Đối với các vi phạm nghiêm trọng (bán hàng cấm, lừa đảo), tin đăng sẽ bị gỡ bỏ ngay lập tức và tài khoản người bán bị khóa vĩnh viễn.</w:t>
+      </w:r>
+    </w:p>
+    <w:p>
+      <w:pPr>
+        <w:pStyle w:val="ListBullet"/>
+      </w:pPr>
+      <w:r>
+        <w:rPr>
+          <w:rFonts w:ascii="Times New Roman" w:hAnsi="Times New Roman" w:eastAsia="Times New Roman" w:cs="Times New Roman"/>
+          <w:b w:val="0"/>
+          <w:i w:val="0"/>
+        </w:rPr>
+        <w:t>Phối hợp với cơ quan chức năng: Cung cấp thông tin của thành viên vi phạm pháp luật cho cơ quan công an khi có yêu cầu điều tra.</w:t>
+      </w:r>
+    </w:p>
+    <w:p>
+      <w:pPr>
+        <w:pStyle w:val="Heading2"/>
+      </w:pPr>
+      <w:r>
+        <w:rPr>
+          <w:rFonts w:ascii="Times New Roman" w:hAnsi="Times New Roman" w:eastAsia="Times New Roman" w:cs="Times New Roman"/>
+          <w:b w:val="0"/>
+          <w:i w:val="0"/>
+        </w:rPr>
+        <w:t>3. Cơ chế báo cáo nội dung xấu dành cho người tiêu dùng:</w:t>
+      </w:r>
+    </w:p>
+    <w:p>
+      <w:r>
+        <w:rPr>
+          <w:rFonts w:ascii="Times New Roman" w:hAnsi="Times New Roman" w:eastAsia="Times New Roman" w:cs="Times New Roman"/>
+          <w:b w:val="0"/>
+          <w:i w:val="0"/>
+        </w:rPr>
+        <w:t>Tại mỗi tin đăng hoặc gian hàng, website cung cấp nút báo cáo vi phạm (hoặc người dùng có thể liên hệ trực tiếp qua hotline 0979.553.289 và email congvinh298@gmail.com). Khi nhận được báo cáo, Ban quản lý sẽ kiểm tra nội dung bị phản ánh trong vòng 04 giờ làm việc và đưa ra biện pháp ẩn hoặc xóa nếu phát hiện vi phạm thực tế.</w:t>
       </w:r>
     </w:p>
     <w:p>
@@ -5529,7 +5862,7 @@
                 <w:b w:val="0"/>
                 <w:sz w:val="24"/>
               </w:rPr>
-              <w:t>Congvinh28@gmail.com</w:t>
+              <w:t>Congvinh298@gmail.com</w:t>
             </w:r>
           </w:p>
         </w:tc>

</xml_diff>